<commit_message>
Seed demo inventory on first run
</commit_message>
<xml_diff>
--- a/docs/Project_Run_and_GitHub_Evidence.docx
+++ b/docs/Project_Run_and_GitHub_Evidence.docx
@@ -25,7 +25,7 @@
         <w:spacing w:after="120"/>
       </w:pPr>
       <w:r>
-        <w:t>This hand-in records the running local app, the fictional batches currently loaded, and verification commands. The project is committed locally on branch main; publishing will need the GitHub owner and repository details.</w:t>
+        <w:t>This hand-in records the running local app and the fictional batches currently loaded. The project is committed locally on branch main and is prepared for publication to Sherlin-S-tech/MediStock as a public repository.</w:t>
       </w:r>
     </w:p>
     <w:p>
@@ -645,7 +645,7 @@
     </w:tbl>
     <w:p>
       <w:r>
-        <w:t>The database is created automatically. Add your own records with Add medicine; demo records remain available as examples.</w:t>
+        <w:t>An empty database is initialized with the three fictional records listed above. Existing inventories are preserved. Set SEED_DEMO_DATA=false to disable automatic seeding.</w:t>
       </w:r>
     </w:p>
     <w:p>
@@ -653,61 +653,12 @@
         <w:pStyle w:val="Heading1"/>
       </w:pPr>
       <w:r>
-        <w:t>Terminal verification transcript</w:t>
+        <w:t>Terminal screenshots</w:t>
       </w:r>
     </w:p>
     <w:p>
       <w:r>
-        <w:t>This formatted transcript reproduces command output from the local checks. The dashboard above is a browser screenshot.</w:t>
-      </w:r>
-    </w:p>
-    <w:p>
-      <w:r>
-        <w:drawing>
-          <wp:inline xmlns:a="http://schemas.openxmlformats.org/drawingml/2006/main" xmlns:pic="http://schemas.openxmlformats.org/drawingml/2006/picture">
-            <wp:extent cx="6327648" cy="3559302"/>
-            <wp:docPr id="2" name="Picture 2"/>
-            <wp:cNvGraphicFramePr>
-              <a:graphicFrameLocks noChangeAspect="1"/>
-            </wp:cNvGraphicFramePr>
-            <a:graphic>
-              <a:graphicData uri="http://schemas.openxmlformats.org/drawingml/2006/picture">
-                <pic:pic>
-                  <pic:nvPicPr>
-                    <pic:cNvPr id="0" name="terminal-transcript.png"/>
-                    <pic:cNvPicPr/>
-                  </pic:nvPicPr>
-                  <pic:blipFill>
-                    <a:blip r:embed="rId12"/>
-                    <a:stretch>
-                      <a:fillRect/>
-                    </a:stretch>
-                  </pic:blipFill>
-                  <pic:spPr>
-                    <a:xfrm>
-                      <a:off x="0" y="0"/>
-                      <a:ext cx="6327648" cy="3559302"/>
-                    </a:xfrm>
-                    <a:prstGeom prst="rect"/>
-                  </pic:spPr>
-                </pic:pic>
-              </a:graphicData>
-            </a:graphic>
-          </wp:inline>
-        </w:drawing>
-      </w:r>
-    </w:p>
-    <w:p>
-      <w:pPr>
-        <w:jc w:val="center"/>
-      </w:pPr>
-      <w:r>
-        <w:rPr>
-          <w:i/>
-          <w:color w:val="6B7E75"/>
-          <w:sz w:val="16"/>
-        </w:rPr>
-        <w:t>Checks shown: pytest, Compose configuration, health endpoint, and local Git status.</w:t>
+        <w:t>No terminal image is included because an original PowerShell window capture was not available in this session.</w:t>
       </w:r>
     </w:p>
     <w:p>
@@ -720,12 +671,12 @@
     </w:p>
     <w:p>
       <w:r>
-        <w:t>A local Git repository is ready on branch main with commit d044db3 (Build medicine stock and expiry tracking project). The working tree is clean. No remote repository has been created or pushed.</w:t>
+        <w:t>The local main branch tracks origin/main at https://github.com/Sherlin-S-tech/MediStock. The initial project commits are present on that remote; the auto-seeding update still needs to be committed and pushed.</w:t>
       </w:r>
     </w:p>
     <w:p>
       <w:r>
-        <w:t>To publish, provide the GitHub username or organization, repository name, and whether it should be public or private. Do not send a password or access token in chat; authenticate through GitHub's normal sign-in or an approved connector when publishing.</w:t>
+        <w:t>An original terminal screenshot is not included because the terminal window was not exposed to this session.</w:t>
       </w:r>
     </w:p>
     <w:sectPr>

</xml_diff>